<commit_message>
Add Lab Assignment 01 - GPIO
</commit_message>
<xml_diff>
--- a/Lab Assigment 01-GPIO/Lab1Assignment 01/SDD/SDD_GPIO_Driver.docx
+++ b/Lab Assigment 01-GPIO/Lab1Assignment 01/SDD/SDD_GPIO_Driver.docx
@@ -10905,6 +10905,60 @@
     </w:p>
     <w:p>
       <w:pPr>
+        <w:spacing w:after="160"/>
+        <w:jc w:val="both"/>
+        <w:rPr>
+          <w:lang w:val="en-US"/>
+        </w:rPr>
+      </w:pPr>
+    </w:p>
+    <w:p>
+      <w:pPr>
+        <w:spacing w:after="160"/>
+        <w:jc w:val="both"/>
+        <w:rPr>
+          <w:lang w:val="en-US"/>
+        </w:rPr>
+      </w:pPr>
+    </w:p>
+    <w:p>
+      <w:pPr>
+        <w:spacing w:after="160"/>
+        <w:jc w:val="both"/>
+        <w:rPr>
+          <w:lang w:val="en-US"/>
+        </w:rPr>
+      </w:pPr>
+    </w:p>
+    <w:p>
+      <w:pPr>
+        <w:spacing w:after="160"/>
+        <w:jc w:val="both"/>
+        <w:rPr>
+          <w:lang w:val="en-US"/>
+        </w:rPr>
+      </w:pPr>
+    </w:p>
+    <w:p>
+      <w:pPr>
+        <w:spacing w:after="160"/>
+        <w:jc w:val="both"/>
+        <w:rPr>
+          <w:lang w:val="en-US"/>
+        </w:rPr>
+      </w:pPr>
+    </w:p>
+    <w:p>
+      <w:pPr>
+        <w:spacing w:after="160"/>
+        <w:jc w:val="both"/>
+        <w:rPr>
+          <w:lang w:val="en-US"/>
+        </w:rPr>
+      </w:pPr>
+    </w:p>
+    <w:p>
+      <w:pPr>
         <w:spacing w:after="80"/>
         <w:rPr>
           <w:lang w:val="en-US"/>
@@ -10927,6 +10981,7 @@
           <w:bCs/>
           <w:lang w:val="en-US"/>
         </w:rPr>
+        <w:lastRenderedPageBreak/>
         <w:t>gpio_</w:t>
       </w:r>
       <w:proofErr w:type="gramStart"/>
@@ -10971,7 +11026,6 @@
         <w:rPr>
           <w:noProof/>
         </w:rPr>
-        <w:lastRenderedPageBreak/>
         <w:drawing>
           <wp:inline distT="0" distB="0" distL="0" distR="0" wp14:anchorId="5F2B6673" wp14:editId="63839907">
             <wp:extent cx="5485765" cy="2240212"/>
@@ -11077,14 +11131,232 @@
     </w:p>
     <w:p>
       <w:pPr>
+        <w:spacing w:after="160"/>
+        <w:jc w:val="both"/>
+        <w:rPr>
+          <w:lang w:val="en-US"/>
+        </w:rPr>
+      </w:pPr>
+      <w:r>
+        <w:rPr>
+          <w:lang w:val="en-US"/>
+        </w:rPr>
+        <w:t xml:space="preserve">The sequence diagram for </w:t>
+      </w:r>
+      <w:proofErr w:type="spellStart"/>
+      <w:r>
+        <w:rPr>
+          <w:lang w:val="en-US"/>
+        </w:rPr>
+        <w:t>gpio_</w:t>
+      </w:r>
+      <w:proofErr w:type="gramStart"/>
+      <w:r>
+        <w:rPr>
+          <w:lang w:val="en-US"/>
+        </w:rPr>
+        <w:t>setAlternateFunction</w:t>
+      </w:r>
+      <w:proofErr w:type="spellEnd"/>
+      <w:r>
+        <w:rPr>
+          <w:lang w:val="en-US"/>
+        </w:rPr>
+        <w:t>(</w:t>
+      </w:r>
+      <w:proofErr w:type="gramEnd"/>
+      <w:r>
+        <w:rPr>
+          <w:lang w:val="en-US"/>
+        </w:rPr>
+        <w:t xml:space="preserve">) shows the driver's most extensive validation chain: first </w:t>
+      </w:r>
+      <w:proofErr w:type="spellStart"/>
+      <w:r>
+        <w:rPr>
+          <w:lang w:val="en-US"/>
+        </w:rPr>
+        <w:t>prv_</w:t>
+      </w:r>
+      <w:proofErr w:type="gramStart"/>
+      <w:r>
+        <w:rPr>
+          <w:lang w:val="en-US"/>
+        </w:rPr>
+        <w:t>validate</w:t>
+      </w:r>
+      <w:proofErr w:type="spellEnd"/>
+      <w:r>
+        <w:rPr>
+          <w:lang w:val="en-US"/>
+        </w:rPr>
+        <w:t>(</w:t>
+      </w:r>
+      <w:proofErr w:type="gramEnd"/>
+      <w:r>
+        <w:rPr>
+          <w:lang w:val="en-US"/>
+        </w:rPr>
+        <w:t xml:space="preserve">) checks port and pin, then an explicit guard rejects </w:t>
+      </w:r>
+      <w:proofErr w:type="spellStart"/>
+      <w:r>
+        <w:rPr>
+          <w:lang w:val="en-US"/>
+        </w:rPr>
+        <w:t>af</w:t>
+      </w:r>
+      <w:proofErr w:type="spellEnd"/>
+      <w:r>
+        <w:rPr>
+          <w:lang w:val="en-US"/>
+        </w:rPr>
+        <w:t xml:space="preserve"> values greater than 15, returning GPIO_ERR_INVALID_AF. With all three arguments valid, the function selects the correct AFR bank: </w:t>
+      </w:r>
+      <w:proofErr w:type="gramStart"/>
+      <w:r>
+        <w:rPr>
+          <w:lang w:val="en-US"/>
+        </w:rPr>
+        <w:t>AFR[</w:t>
+      </w:r>
+      <w:proofErr w:type="gramEnd"/>
+      <w:r>
+        <w:rPr>
+          <w:lang w:val="en-US"/>
+        </w:rPr>
+        <w:t xml:space="preserve">0] for pins 0–7 and </w:t>
+      </w:r>
+      <w:proofErr w:type="gramStart"/>
+      <w:r>
+        <w:rPr>
+          <w:lang w:val="en-US"/>
+        </w:rPr>
+        <w:t>AFR[</w:t>
+      </w:r>
+      <w:proofErr w:type="gramEnd"/>
+      <w:r>
+        <w:rPr>
+          <w:lang w:val="en-US"/>
+        </w:rPr>
+        <w:t xml:space="preserve">1] for pins 8–15 (using </w:t>
+      </w:r>
+      <w:proofErr w:type="spellStart"/>
+      <w:r>
+        <w:rPr>
+          <w:lang w:val="en-US"/>
+        </w:rPr>
+        <w:t>idx</w:t>
+      </w:r>
+      <w:proofErr w:type="spellEnd"/>
+      <w:r>
+        <w:rPr>
+          <w:lang w:val="en-US"/>
+        </w:rPr>
+        <w:t xml:space="preserve"> = pin &gt;&gt; 3). The field offset within the register is shift = (pin &amp; 7) &lt;&lt; 2, which positions the 4-bit alternate function field at its exact location. The write operation applies a clear mask (</w:t>
+      </w:r>
+      <w:proofErr w:type="gramStart"/>
+      <w:r>
+        <w:rPr>
+          <w:lang w:val="en-US"/>
+        </w:rPr>
+        <w:t>AFR[</w:t>
+      </w:r>
+      <w:proofErr w:type="spellStart"/>
+      <w:proofErr w:type="gramEnd"/>
+      <w:r>
+        <w:rPr>
+          <w:lang w:val="en-US"/>
+        </w:rPr>
+        <w:t>idx</w:t>
+      </w:r>
+      <w:proofErr w:type="spellEnd"/>
+      <w:r>
+        <w:rPr>
+          <w:lang w:val="en-US"/>
+        </w:rPr>
+        <w:t xml:space="preserve">] &amp;= </w:t>
+      </w:r>
+      <w:proofErr w:type="gramStart"/>
+      <w:r>
+        <w:rPr>
+          <w:lang w:val="en-US"/>
+        </w:rPr>
+        <w:t>~(</w:t>
+      </w:r>
+      <w:proofErr w:type="gramEnd"/>
+      <w:r>
+        <w:rPr>
+          <w:lang w:val="en-US"/>
+        </w:rPr>
+        <w:t xml:space="preserve">0xF &lt;&lt; shift)) followed by an OR with the </w:t>
+      </w:r>
+      <w:proofErr w:type="spellStart"/>
+      <w:r>
+        <w:rPr>
+          <w:lang w:val="en-US"/>
+        </w:rPr>
+        <w:t>af</w:t>
+      </w:r>
+      <w:proofErr w:type="spellEnd"/>
+      <w:r>
+        <w:rPr>
+          <w:lang w:val="en-US"/>
+        </w:rPr>
+        <w:t xml:space="preserve"> value (</w:t>
+      </w:r>
+      <w:proofErr w:type="gramStart"/>
+      <w:r>
+        <w:rPr>
+          <w:lang w:val="en-US"/>
+        </w:rPr>
+        <w:t>AFR[</w:t>
+      </w:r>
+      <w:proofErr w:type="spellStart"/>
+      <w:proofErr w:type="gramEnd"/>
+      <w:r>
+        <w:rPr>
+          <w:lang w:val="en-US"/>
+        </w:rPr>
+        <w:t>idx</w:t>
+      </w:r>
+      <w:proofErr w:type="spellEnd"/>
+      <w:r>
+        <w:rPr>
+          <w:lang w:val="en-US"/>
+        </w:rPr>
+        <w:t xml:space="preserve">] |= </w:t>
+      </w:r>
+      <w:proofErr w:type="spellStart"/>
+      <w:r>
+        <w:rPr>
+          <w:lang w:val="en-US"/>
+        </w:rPr>
+        <w:t>af</w:t>
+      </w:r>
+      <w:proofErr w:type="spellEnd"/>
+      <w:r>
+        <w:rPr>
+          <w:lang w:val="en-US"/>
+        </w:rPr>
+        <w:t xml:space="preserve"> &lt;&lt; shift), leaving the 4-bit fields of neighboring pins untouched.</w:t>
+      </w:r>
+    </w:p>
+    <w:p>
+      <w:pPr>
+        <w:spacing w:after="160"/>
         <w:jc w:val="center"/>
+        <w:rPr>
+          <w:lang w:val="en-US"/>
+        </w:rPr>
       </w:pPr>
       <w:r>
         <w:rPr>
           <w:noProof/>
         </w:rPr>
+        <w:lastRenderedPageBreak/>
         <w:drawing>
-          <wp:inline distT="0" distB="0" distL="0" distR="0" wp14:anchorId="5EE3077D" wp14:editId="44B814D0">
+          <wp:inline distT="0" distB="0" distL="0" distR="0" wp14:anchorId="53210BF7" wp14:editId="35D4EEB4">
             <wp:extent cx="3656965" cy="4921925"/>
             <wp:effectExtent l="0" t="0" r="635" b="0"/>
             <wp:docPr id="214" name="Diagram214"/>
@@ -11134,226 +11406,6 @@
     </w:p>
     <w:p>
       <w:pPr>
-        <w:spacing w:after="160"/>
-        <w:jc w:val="both"/>
-        <w:rPr>
-          <w:lang w:val="en-US"/>
-        </w:rPr>
-      </w:pPr>
-      <w:r>
-        <w:rPr>
-          <w:lang w:val="en-US"/>
-        </w:rPr>
-        <w:t xml:space="preserve">The sequence diagram for </w:t>
-      </w:r>
-      <w:proofErr w:type="spellStart"/>
-      <w:r>
-        <w:rPr>
-          <w:lang w:val="en-US"/>
-        </w:rPr>
-        <w:t>gpio_</w:t>
-      </w:r>
-      <w:proofErr w:type="gramStart"/>
-      <w:r>
-        <w:rPr>
-          <w:lang w:val="en-US"/>
-        </w:rPr>
-        <w:t>setAlternateFunction</w:t>
-      </w:r>
-      <w:proofErr w:type="spellEnd"/>
-      <w:r>
-        <w:rPr>
-          <w:lang w:val="en-US"/>
-        </w:rPr>
-        <w:t>(</w:t>
-      </w:r>
-      <w:proofErr w:type="gramEnd"/>
-      <w:r>
-        <w:rPr>
-          <w:lang w:val="en-US"/>
-        </w:rPr>
-        <w:t xml:space="preserve">) shows the driver's most extensive validation chain: first </w:t>
-      </w:r>
-      <w:proofErr w:type="spellStart"/>
-      <w:r>
-        <w:rPr>
-          <w:lang w:val="en-US"/>
-        </w:rPr>
-        <w:t>prv_</w:t>
-      </w:r>
-      <w:proofErr w:type="gramStart"/>
-      <w:r>
-        <w:rPr>
-          <w:lang w:val="en-US"/>
-        </w:rPr>
-        <w:t>validate</w:t>
-      </w:r>
-      <w:proofErr w:type="spellEnd"/>
-      <w:r>
-        <w:rPr>
-          <w:lang w:val="en-US"/>
-        </w:rPr>
-        <w:t>(</w:t>
-      </w:r>
-      <w:proofErr w:type="gramEnd"/>
-      <w:r>
-        <w:rPr>
-          <w:lang w:val="en-US"/>
-        </w:rPr>
-        <w:t xml:space="preserve">) checks port and pin, then an explicit guard rejects </w:t>
-      </w:r>
-      <w:proofErr w:type="spellStart"/>
-      <w:r>
-        <w:rPr>
-          <w:lang w:val="en-US"/>
-        </w:rPr>
-        <w:t>af</w:t>
-      </w:r>
-      <w:proofErr w:type="spellEnd"/>
-      <w:r>
-        <w:rPr>
-          <w:lang w:val="en-US"/>
-        </w:rPr>
-        <w:t xml:space="preserve"> values greater than 15, returning GPIO_ERR_INVALID_AF. With all three arguments valid, the function selects the correct AFR bank: </w:t>
-      </w:r>
-      <w:proofErr w:type="gramStart"/>
-      <w:r>
-        <w:rPr>
-          <w:lang w:val="en-US"/>
-        </w:rPr>
-        <w:t>AFR[</w:t>
-      </w:r>
-      <w:proofErr w:type="gramEnd"/>
-      <w:r>
-        <w:rPr>
-          <w:lang w:val="en-US"/>
-        </w:rPr>
-        <w:t xml:space="preserve">0] for pins 0–7 and </w:t>
-      </w:r>
-      <w:proofErr w:type="gramStart"/>
-      <w:r>
-        <w:rPr>
-          <w:lang w:val="en-US"/>
-        </w:rPr>
-        <w:t>AFR[</w:t>
-      </w:r>
-      <w:proofErr w:type="gramEnd"/>
-      <w:r>
-        <w:rPr>
-          <w:lang w:val="en-US"/>
-        </w:rPr>
-        <w:t xml:space="preserve">1] for pins 8–15 (using </w:t>
-      </w:r>
-      <w:proofErr w:type="spellStart"/>
-      <w:r>
-        <w:rPr>
-          <w:lang w:val="en-US"/>
-        </w:rPr>
-        <w:t>idx</w:t>
-      </w:r>
-      <w:proofErr w:type="spellEnd"/>
-      <w:r>
-        <w:rPr>
-          <w:lang w:val="en-US"/>
-        </w:rPr>
-        <w:t xml:space="preserve"> = pin &gt;&gt; 3). The field offset within the register is shift = (pin &amp; 7) &lt;&lt; 2, which positions the 4-bit alternate function field at its exact location. The write operation applies a clear mask </w:t>
-      </w:r>
-      <w:r>
-        <w:rPr>
-          <w:lang w:val="en-US"/>
-        </w:rPr>
-        <w:lastRenderedPageBreak/>
-        <w:t>(</w:t>
-      </w:r>
-      <w:proofErr w:type="gramStart"/>
-      <w:r>
-        <w:rPr>
-          <w:lang w:val="en-US"/>
-        </w:rPr>
-        <w:t>AFR[</w:t>
-      </w:r>
-      <w:proofErr w:type="spellStart"/>
-      <w:proofErr w:type="gramEnd"/>
-      <w:r>
-        <w:rPr>
-          <w:lang w:val="en-US"/>
-        </w:rPr>
-        <w:t>idx</w:t>
-      </w:r>
-      <w:proofErr w:type="spellEnd"/>
-      <w:r>
-        <w:rPr>
-          <w:lang w:val="en-US"/>
-        </w:rPr>
-        <w:t xml:space="preserve">] &amp;= </w:t>
-      </w:r>
-      <w:proofErr w:type="gramStart"/>
-      <w:r>
-        <w:rPr>
-          <w:lang w:val="en-US"/>
-        </w:rPr>
-        <w:t>~(</w:t>
-      </w:r>
-      <w:proofErr w:type="gramEnd"/>
-      <w:r>
-        <w:rPr>
-          <w:lang w:val="en-US"/>
-        </w:rPr>
-        <w:t xml:space="preserve">0xF &lt;&lt; shift)) followed by an OR with the </w:t>
-      </w:r>
-      <w:proofErr w:type="spellStart"/>
-      <w:r>
-        <w:rPr>
-          <w:lang w:val="en-US"/>
-        </w:rPr>
-        <w:t>af</w:t>
-      </w:r>
-      <w:proofErr w:type="spellEnd"/>
-      <w:r>
-        <w:rPr>
-          <w:lang w:val="en-US"/>
-        </w:rPr>
-        <w:t xml:space="preserve"> value (</w:t>
-      </w:r>
-      <w:proofErr w:type="gramStart"/>
-      <w:r>
-        <w:rPr>
-          <w:lang w:val="en-US"/>
-        </w:rPr>
-        <w:t>AFR[</w:t>
-      </w:r>
-      <w:proofErr w:type="spellStart"/>
-      <w:proofErr w:type="gramEnd"/>
-      <w:r>
-        <w:rPr>
-          <w:lang w:val="en-US"/>
-        </w:rPr>
-        <w:t>idx</w:t>
-      </w:r>
-      <w:proofErr w:type="spellEnd"/>
-      <w:r>
-        <w:rPr>
-          <w:lang w:val="en-US"/>
-        </w:rPr>
-        <w:t xml:space="preserve">] |= </w:t>
-      </w:r>
-      <w:proofErr w:type="spellStart"/>
-      <w:r>
-        <w:rPr>
-          <w:lang w:val="en-US"/>
-        </w:rPr>
-        <w:t>af</w:t>
-      </w:r>
-      <w:proofErr w:type="spellEnd"/>
-      <w:r>
-        <w:rPr>
-          <w:lang w:val="en-US"/>
-        </w:rPr>
-        <w:t xml:space="preserve"> &lt;&lt; shift), leaving the 4-bit fields of neighboring pins untouched.</w:t>
-      </w:r>
-    </w:p>
-    <w:p>
-      <w:pPr>
         <w:jc w:val="center"/>
         <w:rPr>
           <w:i/>
@@ -11569,6 +11621,7 @@
           <w:bCs/>
           <w:lang w:val="en-US"/>
         </w:rPr>
+        <w:lastRenderedPageBreak/>
         <w:t>Internal Data Structures</w:t>
       </w:r>
     </w:p>
@@ -11847,14 +11900,7 @@
         <w:rPr>
           <w:lang w:val="en-US"/>
         </w:rPr>
-        <w:t xml:space="preserve">) (FR-1, Fig. 9–10) enables all six GPIO peripheral clocks in a single OR-write to RCC-&gt;AHB1ENR: RCC-&gt;AHB1ENR |= (GPIOAEN | GPIOBEN | GPIOCEN | GPIODEN | GPIOEEN | GPIOHEN). It then sets each port's MODER register to its RM0383 post-reset default: GPIOA = 0xA8000000 (preserving PA13/PA15 for SWD), GPIOB = 0x00000280, and all others = 0x00000000. </w:t>
-      </w:r>
-      <w:r>
-        <w:rPr>
-          <w:lang w:val="en-US"/>
-        </w:rPr>
-        <w:lastRenderedPageBreak/>
-        <w:t xml:space="preserve">Because </w:t>
+        <w:t xml:space="preserve">) (FR-1, Fig. 9–10) enables all six GPIO peripheral clocks in a single OR-write to RCC-&gt;AHB1ENR: RCC-&gt;AHB1ENR |= (GPIOAEN | GPIOBEN | GPIOCEN | GPIODEN | GPIOEEN | GPIOHEN). It then sets each port's MODER register to its RM0383 post-reset default: GPIOA = 0xA8000000 (preserving PA13/PA15 for SWD), GPIOB = 0x00000280, and all others = 0x00000000. Because </w:t>
       </w:r>
       <w:proofErr w:type="spellStart"/>
       <w:r>
@@ -12140,6 +12186,7 @@
           <w:bCs/>
           <w:lang w:val="en-US"/>
         </w:rPr>
+        <w:lastRenderedPageBreak/>
         <w:t>Pin Output Control</w:t>
       </w:r>
     </w:p>
@@ -12303,14 +12350,7 @@
         <w:rPr>
           <w:lang w:val="en-US"/>
         </w:rPr>
-        <w:t xml:space="preserve">) (FR-7, Fig. 19–20) reads the logical level on a pin by sampling the IDR (Input Data Register). The result is written to the caller-provided pointer *state as either GPIO_PIN_HIGH or GPIO_PIN_LOW. The function implements the driver's most defensive </w:t>
-      </w:r>
-      <w:r>
-        <w:rPr>
-          <w:lang w:val="en-US"/>
-        </w:rPr>
-        <w:lastRenderedPageBreak/>
-        <w:t xml:space="preserve">validation chain: it checks for a NULL state pointer before calling </w:t>
+        <w:t xml:space="preserve">) (FR-7, Fig. 19–20) reads the logical level on a pin by sampling the IDR (Input Data Register). The result is written to the caller-provided pointer *state as either GPIO_PIN_HIGH or GPIO_PIN_LOW. The function implements the driver's most defensive validation chain: it checks for a NULL state pointer before calling </w:t>
       </w:r>
       <w:proofErr w:type="spellStart"/>
       <w:r>
@@ -12716,7 +12756,14 @@
         <w:rPr>
           <w:lang w:val="en-US"/>
         </w:rPr>
-        <w:t>). Error codes are negative integers so they can be distinguished from GPIO_OK = 0 by a simple comparison. Refer to Section 4.2 for the complete error code reference.</w:t>
+        <w:t xml:space="preserve">). Error codes are negative integers so they can be distinguished </w:t>
+      </w:r>
+      <w:r>
+        <w:rPr>
+          <w:lang w:val="en-US"/>
+        </w:rPr>
+        <w:lastRenderedPageBreak/>
+        <w:t>from GPIO_OK = 0 by a simple comparison. Refer to Section 4.2 for the complete error code reference.</w:t>
       </w:r>
     </w:p>
     <w:p>
@@ -13207,7 +13254,6 @@
                 <w:b/>
                 <w:bCs/>
               </w:rPr>
-              <w:lastRenderedPageBreak/>
               <w:t>Member</w:t>
             </w:r>
             <w:proofErr w:type="spellEnd"/>
@@ -13926,6 +13972,7 @@
           <w:bCs/>
           <w:lang w:val="en-US"/>
         </w:rPr>
+        <w:lastRenderedPageBreak/>
         <w:t>GPIO_OType_t</w:t>
       </w:r>
       <w:proofErr w:type="spellEnd"/>
@@ -14483,7 +14530,6 @@
               <w:rPr>
                 <w:lang w:val="en-US"/>
               </w:rPr>
-              <w:lastRenderedPageBreak/>
               <w:t>GPIOx</w:t>
             </w:r>
             <w:proofErr w:type="spellEnd"/>
@@ -15801,6 +15847,7 @@
               <w:rPr>
                 <w:lang w:val="en-US"/>
               </w:rPr>
+              <w:lastRenderedPageBreak/>
               <w:t>GPIOx</w:t>
             </w:r>
             <w:proofErr w:type="spellEnd"/>
@@ -16723,7 +16770,6 @@
               <w:rPr>
                 <w:lang w:val="en-US"/>
               </w:rPr>
-              <w:lastRenderedPageBreak/>
               <w:t>PUPDR</w:t>
             </w:r>
           </w:p>
@@ -17713,6 +17759,7 @@
               <w:rPr>
                 <w:lang w:val="en-US"/>
               </w:rPr>
+              <w:lastRenderedPageBreak/>
               <w:t>GPIO_OK</w:t>
             </w:r>
           </w:p>
@@ -18289,7 +18336,6 @@
               <w:rPr>
                 <w:lang w:val="en-US"/>
               </w:rPr>
-              <w:lastRenderedPageBreak/>
               <w:t>GPIO_ERR_INVALID_MODE</w:t>
             </w:r>
           </w:p>
@@ -18988,6 +19034,7 @@
                 <w:bCs/>
                 <w:color w:val="FFFFFF"/>
               </w:rPr>
+              <w:lastRenderedPageBreak/>
               <w:t>Function</w:t>
             </w:r>
             <w:proofErr w:type="spellEnd"/>
@@ -19880,7 +19927,6 @@
                 <w:bCs/>
                 <w:color w:val="FFFFFF"/>
               </w:rPr>
-              <w:lastRenderedPageBreak/>
               <w:t xml:space="preserve">Available </w:t>
             </w:r>
             <w:proofErr w:type="spellStart"/>
@@ -20873,6 +20919,7 @@
                 <w:bCs/>
                 <w:color w:val="FFFFFF"/>
               </w:rPr>
+              <w:lastRenderedPageBreak/>
               <w:t>Constraints</w:t>
             </w:r>
             <w:proofErr w:type="spellEnd"/>
@@ -22581,6 +22628,7 @@
                 <w:bCs/>
                 <w:color w:val="FFFFFF"/>
               </w:rPr>
+              <w:lastRenderedPageBreak/>
               <w:t>Function</w:t>
             </w:r>
             <w:proofErr w:type="spellEnd"/>
@@ -23373,7 +23421,6 @@
                 <w:bCs/>
                 <w:color w:val="FFFFFF"/>
               </w:rPr>
-              <w:lastRenderedPageBreak/>
               <w:t>Description</w:t>
             </w:r>
             <w:proofErr w:type="spellEnd"/>
@@ -24481,6 +24528,7 @@
                 <w:bCs/>
                 <w:color w:val="FFFFFF"/>
               </w:rPr>
+              <w:lastRenderedPageBreak/>
               <w:t>Return</w:t>
             </w:r>
             <w:proofErr w:type="spellEnd"/>
@@ -25246,7 +25294,6 @@
                 <w:bCs/>
                 <w:color w:val="FFFFFF"/>
               </w:rPr>
-              <w:lastRenderedPageBreak/>
               <w:t>Parameters</w:t>
             </w:r>
             <w:proofErr w:type="spellEnd"/>
@@ -26276,6 +26323,7 @@
                 <w:bCs/>
                 <w:color w:val="FFFFFF"/>
               </w:rPr>
+              <w:lastRenderedPageBreak/>
               <w:t>Syntax</w:t>
             </w:r>
             <w:proofErr w:type="spellEnd"/>
@@ -27020,7 +27068,6 @@
                 <w:bCs/>
                 <w:color w:val="FFFFFF"/>
               </w:rPr>
-              <w:lastRenderedPageBreak/>
               <w:t>Description</w:t>
             </w:r>
             <w:proofErr w:type="spellEnd"/>
@@ -27921,6 +27968,7 @@
                 <w:bCs/>
                 <w:color w:val="FFFFFF"/>
               </w:rPr>
+              <w:lastRenderedPageBreak/>
               <w:t>Parameters</w:t>
             </w:r>
             <w:proofErr w:type="spellEnd"/>
@@ -28723,7 +28771,6 @@
           <w:b/>
           <w:bCs/>
         </w:rPr>
-        <w:lastRenderedPageBreak/>
         <w:t xml:space="preserve">4.4. </w:t>
       </w:r>
       <w:proofErr w:type="spellStart"/>
@@ -29719,6 +29766,7 @@
                 <w:bCs/>
                 <w:color w:val="FFFFFF"/>
               </w:rPr>
+              <w:lastRenderedPageBreak/>
               <w:t>Description</w:t>
             </w:r>
             <w:proofErr w:type="spellEnd"/>
@@ -30490,7 +30538,6 @@
                 <w:bCs/>
                 <w:color w:val="FFFFFF"/>
               </w:rPr>
-              <w:lastRenderedPageBreak/>
               <w:t>Parameters</w:t>
             </w:r>
             <w:proofErr w:type="spellEnd"/>

</xml_diff>